<commit_message>
Add presentation figures for 30-variant study
</commit_message>
<xml_diff>
--- a/docs/presentation/Imbalanced_Learning_30_Dataset_Results.docx
+++ b/docs/presentation/Imbalanced_Learning_30_Dataset_Results.docx
@@ -2787,7 +2787,7 @@
       </w:r>
     </w:p>
     <w:bookmarkEnd w:id="25"/>
-    <w:bookmarkStart w:id="32" w:name="files-and-provenance"/>
+    <w:bookmarkStart w:id="34" w:name="files-and-provenance"/>
     <w:p>
       <w:pPr>
         <w:pStyle w:val="Heading1"/>
@@ -2805,6 +2805,43 @@
         </w:numPr>
       </w:pPr>
       <w:hyperlink r:id="rId26">
+        <w:r>
+          <w:rPr>
+            <w:rStyle w:val="Hyperlink"/>
+          </w:rPr>
+          <w:t xml:space="preserve">Three-page figure pack</w:t>
+        </w:r>
+      </w:hyperlink>
+      <w:r>
+        <w:t xml:space="preserve"> </w:t>
+      </w:r>
+      <w:r>
+        <w:t xml:space="preserve">and</w:t>
+      </w:r>
+      <w:r>
+        <w:t xml:space="preserve"> </w:t>
+      </w:r>
+      <w:hyperlink r:id="rId27">
+        <w:r>
+          <w:rPr>
+            <w:rStyle w:val="Hyperlink"/>
+          </w:rPr>
+          <w:t xml:space="preserve">figure-reading guide</w:t>
+        </w:r>
+      </w:hyperlink>
+      <w:r>
+        <w:t xml:space="preserve">: visual summaries of F1/FPR tradeoffs, per-variant consistency and the SSHR ablation.</w:t>
+      </w:r>
+    </w:p>
+    <w:p>
+      <w:pPr>
+        <w:pStyle w:val="Compact"/>
+        <w:numPr>
+          <w:ilvl w:val="0"/>
+          <w:numId w:val="1002"/>
+        </w:numPr>
+      </w:pPr>
+      <w:hyperlink r:id="rId28">
         <w:r>
           <w:rPr>
             <w:rStyle w:val="Hyperlink"/>
@@ -2824,7 +2861,7 @@
           <w:numId w:val="1002"/>
         </w:numPr>
       </w:pPr>
-      <w:hyperlink r:id="rId27">
+      <w:hyperlink r:id="rId29">
         <w:r>
           <w:rPr>
             <w:rStyle w:val="Hyperlink"/>
@@ -2844,7 +2881,7 @@
           <w:numId w:val="1002"/>
         </w:numPr>
       </w:pPr>
-      <w:hyperlink r:id="rId28">
+      <w:hyperlink r:id="rId30">
         <w:r>
           <w:rPr>
             <w:rStyle w:val="Hyperlink"/>
@@ -2864,7 +2901,7 @@
           <w:numId w:val="1002"/>
         </w:numPr>
       </w:pPr>
-      <w:hyperlink r:id="rId29">
+      <w:hyperlink r:id="rId31">
         <w:r>
           <w:rPr>
             <w:rStyle w:val="Hyperlink"/>
@@ -2884,7 +2921,7 @@
           <w:numId w:val="1002"/>
         </w:numPr>
       </w:pPr>
-      <w:hyperlink r:id="rId30">
+      <w:hyperlink r:id="rId32">
         <w:r>
           <w:rPr>
             <w:rStyle w:val="Hyperlink"/>
@@ -2901,7 +2938,7 @@
       <w:r>
         <w:t xml:space="preserve"> </w:t>
       </w:r>
-      <w:hyperlink r:id="rId31">
+      <w:hyperlink r:id="rId33">
         <w:r>
           <w:rPr>
             <w:rStyle w:val="Hyperlink"/>
@@ -3009,7 +3046,7 @@
         <w:t xml:space="preserve">(2023), DOI 10.1016/j.eswa.2023.119733. This report cites the studied methods; it does not assert exact author-code equivalence.</w:t>
       </w:r>
     </w:p>
-    <w:bookmarkEnd w:id="32"/>
+    <w:bookmarkEnd w:id="34"/>
     <w:sectPr/>
   </w:body>
 </w:document>

</xml_diff>